<commit_message>
docs: update Task 15 Docker evidence with live healthy container execution
</commit_message>
<xml_diff>
--- a/docs/PROJECT_REPORT.docx
+++ b/docs/PROJECT_REPORT.docx
@@ -3439,7 +3439,7 @@
       <w:r>
         <w:drawing>
           <wp:inline xmlns:a="http://schemas.openxmlformats.org/drawingml/2006/main" xmlns:pic="http://schemas.openxmlformats.org/drawingml/2006/picture">
-            <wp:extent cx="5486400" cy="2207419"/>
+            <wp:extent cx="5486400" cy="3491345"/>
             <wp:docPr id="4" name="Picture 4"/>
             <wp:cNvGraphicFramePr>
               <a:graphicFrameLocks noChangeAspect="1"/>
@@ -3460,7 +3460,7 @@
                   <pic:spPr>
                     <a:xfrm>
                       <a:off x="0" y="0"/>
-                      <a:ext cx="5486400" cy="2207419"/>
+                      <a:ext cx="5486400" cy="3491345"/>
                     </a:xfrm>
                     <a:prstGeom prst="rect"/>
                   </pic:spPr>

</xml_diff>